<commit_message>
New translations children with disabilities.docx (Papiamento)
</commit_message>
<xml_diff>
--- a/translations/plh_facilitator_cw/pap/pap_Children with Disabilities.docx
+++ b/translations/plh_facilitator_cw/pap/pap_Children with Disabilities.docx
@@ -15,7 +15,7 @@
       <w:bookmarkStart w:colFirst="0" w:colLast="0" w:name="_vo8ju23co9c5" w:id="0"/>
       <w:bookmarkEnd w:id="0"/>
       <w:r>
-        <w:t xml:space="preserve">Bista General riba Sosten pa Mayornan Ku Tin Yu ku Desabilidat</w:t>
+        <w:t xml:space="preserve">Bista General tokante Sosten na Mayornan Ku Tin Yu ku Desabilidat</w:t>
       </w:r>
     </w:p>
     <w:p>
@@ -69,7 +69,7 @@
         <w:pStyle w:val="P68B1DB1-Normal3"/>
       </w:pPr>
       <w:r>
-        <w:t xml:space="preserve">Algun punto pa tene na mente ta lo siguiente: </w:t>
+        <w:t xml:space="preserve">Algun punto pa tene kuenta kuné ta lo siguiente: </w:t>
       </w:r>
     </w:p>
     <w:p>
@@ -115,7 +115,7 @@
         <w:t>Suposishonnan:</w:t>
       </w:r>
       <w:r>
-        <w:t xml:space="preserve"> Hopi bia ta asumí eroneamente ku muchanan ku múltiple desabilidat no por komuniká. Nan komunikashon por ta mas sutil, manera pa medio di moveshon di wowo of otro moveshonnan chikí. Un bon komunikashon ku muchanan ku desabilidatnan serio ta rekerí tempu pa krea un método di komunikashon. Un promé stap ta pa puntra otronan kon e mucha ta preferá di komuniká. </w:t>
+        <w:t xml:space="preserve"> Hopi bia ta asumí eroneamente ku muchanan ku múltiple desabilidat no por komuniká. Nan komunikashon por ta mas sutil, manera pa medio di moveshon di wowo of otro moveshonnan chikí. Bon komunikashon ku muchanan ku desabilidatnan serio ta tuma tempu pa krea un método di komunikashon. Un promé stap ta pa puntra otronan kon e mucha ta preferá di komuniká. </w:t>
       </w:r>
     </w:p>
     <w:p>
@@ -161,7 +161,7 @@
         <w:t xml:space="preserve">Ambiente físiko:</w:t>
       </w:r>
       <w:r>
-        <w:t xml:space="preserve"> Un área mal trahá sin fronteranan klaramente definí por ta konfuso pa muchanan, spesialmente esnan ku desabilidatnan sensorial òf kognitivo. Iluminashon i temperatura tambe ta elementonan esensial pa konsiderá. Por ehèmpel, lugánan friu/kayente i ku hopi lus/skur por afektá estado di ánimo i komportashon. Mester hasi tur área rondó di e mucha ku desabilidat físiko, aksesibel pa e mucha </w:t>
+        <w:t xml:space="preserve"> Un área mal trahá sin fronteranan klaramente definí por brua muchanan, spesialmente esnan ku desabilidatnan di sentido (zintuiglijk) òf kognitivo. Iluminashon i temperatura tambe ta elementonan esensial pa konsiderá. Por ehèmpel, lugánan friu/kayente i ku hopi lus/skur por afektá estado di ánimo i komportashon. Mester hasi tur área rondó di e mucha ku desabilidat físiko, aksesibel pa e mucha </w:t>
       </w:r>
     </w:p>
     <w:p>
@@ -207,7 +207,7 @@
         <w:t xml:space="preserve">E desabilidatnan:</w:t>
       </w:r>
       <w:r>
-        <w:t xml:space="preserve"> Apesar ku konosementu profundo di tur desabilidat no ta nesesario, ta importante pa komprondé sí i kon e abilidat di e mucha pa usa abla i lenguahe di kurpa ta keda afektá i kua métodonan spesífiko di komunikashon ta mihó pa e mucha. </w:t>
+        <w:t xml:space="preserve"> Apesar ku konosementu profundo di tur desabilidat no ta nesesario, ta importante pa komprondé, sí i kon e abilidat di e mucha pa usa abla i lenguahe di kurpa ta keda afektá i kua métodonan spesífiko di komunikashon ta mihó pa e mucha. </w:t>
       </w:r>
     </w:p>
     <w:p>
@@ -293,7 +293,7 @@
         <w:pStyle w:val="P68B1DB1-Normal3"/>
       </w:pPr>
       <w:r>
-        <w:t xml:space="preserve">Ku un mucha ku limitashon intelektual, semper papia kla, usando frasenan kòrtiku. Kòrda nan pa usa e nòmber di e mucha pa e mucha sa ku bo ta papiando kuné. </w:t>
+        <w:t xml:space="preserve">Semper papia kla i usa frasenan kòrtiku ku un mucha ku limitashon intelektual. Kòrda nan pa usa e nòmber di e mucha pa e mucha sa ku bo ta papia kuné. </w:t>
       </w:r>
     </w:p>
     <w:p>
@@ -310,7 +310,7 @@
         <w:pStyle w:val="P68B1DB1-Normal3"/>
       </w:pPr>
       <w:r>
-        <w:t xml:space="preserve">Ta hopi importante pa reakshoná riba e intentonan di e mucha pa komuniká, pa e komprondé e efektividat i importansia di komunikashon. Si un mucha ta mustra riba un opheto di interes, e por mustra riba dje i nombr’é bon kla pa indiká ku el a komprondé i ta skuchando.</w:t>
+        <w:t xml:space="preserve">Ta hopi importante pa reakshoná riba e intentonan di e mucha pa komuniká, pa e komprondé e efektividat i importansia di komunikashon. Si un mucha ta mustra riba un opheto di interes, nan por mustra riba dje i nombr’é bon kla pa asina indiká ku nan a komprond'é i a skuch'é.</w:t>
       </w:r>
     </w:p>
     <w:p>
@@ -344,7 +344,7 @@
         <w:pStyle w:val="P68B1DB1-Normal3"/>
       </w:pPr>
       <w:r>
-        <w:t xml:space="preserve">Lo por tuma tempu pa eksplorá e mihó maneranan di komuniká ku un mucha en partikular. Nan lo mester tin mas pasenshi ku nan mes i nan yunan ora di pasa Tempu Abo ku bo YU ku nan yunan.</w:t>
+        <w:t xml:space="preserve">Lo por tuma tempu pa eksplorá e mihó maneranan pa komuniká ku un mucha en partikular. Nan lo mester tin mas pasenshi ku nan mes i nan yunan ora di pasa Tempu Abo ku bo YU ku nan yunan.</w:t>
       </w:r>
     </w:p>
     <w:p>
@@ -360,7 +360,7 @@
       <w:bookmarkStart w:colFirst="0" w:colLast="0" w:name="_82ha2psityi3" w:id="2"/>
       <w:bookmarkEnd w:id="2"/>
       <w:r>
-        <w:t xml:space="preserve">Enbolbí Henter Famia Inkluyendo Muchanan ku Desabilidat</w:t>
+        <w:t xml:space="preserve">Enbolbí Henter Famia Inkluso Muchanan ku Desabilidat</w:t>
       </w:r>
     </w:p>
     <w:p>
@@ -534,7 +534,7 @@
         <w:pStyle w:val="P68B1DB1-Normal3"/>
       </w:pPr>
       <w:r>
-        <w:t xml:space="preserve">Kontrolá pa ta sigur ku e persona ta komprondé e tópiko òf aktividat ku mester kompletá. </w:t>
+        <w:t xml:space="preserve">Kontrolá pa ta sigur ku e persona ta komprondé e tópiko òf aktividat ku e mester kompletá. </w:t>
       </w:r>
     </w:p>
     <w:p>
@@ -551,7 +551,7 @@
         <w:pStyle w:val="P68B1DB1-Normal3"/>
       </w:pPr>
       <w:r>
-        <w:t xml:space="preserve">Inkorporá aktividatnan di siñamentu práktiko den rutina. </w:t>
+        <w:t xml:space="preserve">Hinka aktividatnan di siña dor di praktiká den rutina diario. </w:t>
       </w:r>
     </w:p>
     <w:p>

</xml_diff>